<commit_message>
Modificacion documento Requisitos y casos de usos
</commit_message>
<xml_diff>
--- a/Requisitos Sistema y Casos de Uso.docx
+++ b/Requisitos Sistema y Casos de Uso.docx
@@ -1,6 +1,6 @@
 
 <file path=word/document.xml><?xml version="1.0" encoding="utf-8"?>
-<w:document xmlns:wpc="http://schemas.microsoft.com/office/word/2010/wordprocessingCanvas" xmlns:cx="http://schemas.microsoft.com/office/drawing/2014/chartex" xmlns:cx1="http://schemas.microsoft.com/office/drawing/2015/9/8/chartex" xmlns:cx2="http://schemas.microsoft.com/office/drawing/2015/10/21/chartex" xmlns:cx3="http://schemas.microsoft.com/office/drawing/2016/5/9/chartex" xmlns:cx4="http://schemas.microsoft.com/office/drawing/2016/5/10/chartex" xmlns:cx5="http://schemas.microsoft.com/office/drawing/2016/5/11/chartex" xmlns:cx6="http://schemas.microsoft.com/office/drawing/2016/5/12/chartex" xmlns:cx7="http://schemas.microsoft.com/office/drawing/2016/5/13/chartex" xmlns:cx8="http://schemas.microsoft.com/office/drawing/2016/5/14/chartex" xmlns:mc="http://schemas.openxmlformats.org/markup-compatibility/2006" xmlns:aink="http://schemas.microsoft.com/office/drawing/2016/ink" xmlns:am3d="http://schemas.microsoft.com/office/drawing/2017/model3d" xmlns:o="urn:schemas-microsoft-com:office:office" xmlns:oel="http://schemas.microsoft.com/office/2019/extlst" xmlns:r="http://schemas.openxmlformats.org/officeDocument/2006/relationships" xmlns:m="http://schemas.openxmlformats.org/officeDocument/2006/math" xmlns:v="urn:schemas-microsoft-com:vml" xmlns:wp14="http://schemas.microsoft.com/office/word/2010/wordprocessingDrawing" xmlns:wp="http://schemas.openxmlformats.org/drawingml/2006/wordprocessingDrawing" xmlns:w10="urn:schemas-microsoft-com:office:word" xmlns:w="http://schemas.openxmlformats.org/wordprocessingml/2006/main" xmlns:w14="http://schemas.microsoft.com/office/word/2010/wordml" xmlns:w15="http://schemas.microsoft.com/office/word/2012/wordml" xmlns:w16cex="http://schemas.microsoft.com/office/word/2018/wordml/cex" xmlns:w16cid="http://schemas.microsoft.com/office/word/2016/wordml/cid" xmlns:w16="http://schemas.microsoft.com/office/word/2018/wordml" xmlns:w16sdtdh="http://schemas.microsoft.com/office/word/2020/wordml/sdtdatahash" xmlns:w16se="http://schemas.microsoft.com/office/word/2015/wordml/symex" xmlns:wpg="http://schemas.microsoft.com/office/word/2010/wordprocessingGroup" xmlns:wpi="http://schemas.microsoft.com/office/word/2010/wordprocessingInk" xmlns:wne="http://schemas.microsoft.com/office/word/2006/wordml" xmlns:wps="http://schemas.microsoft.com/office/word/2010/wordprocessingShape" mc:Ignorable="w14 w15 w16se w16cid w16 w16cex w16sdtdh wp14">
+<w:document xmlns:wpc="http://schemas.microsoft.com/office/word/2010/wordprocessingCanvas" xmlns:cx="http://schemas.microsoft.com/office/drawing/2014/chartex" xmlns:cx1="http://schemas.microsoft.com/office/drawing/2015/9/8/chartex" xmlns:cx2="http://schemas.microsoft.com/office/drawing/2015/10/21/chartex" xmlns:cx3="http://schemas.microsoft.com/office/drawing/2016/5/9/chartex" xmlns:cx4="http://schemas.microsoft.com/office/drawing/2016/5/10/chartex" xmlns:cx5="http://schemas.microsoft.com/office/drawing/2016/5/11/chartex" xmlns:cx6="http://schemas.microsoft.com/office/drawing/2016/5/12/chartex" xmlns:cx7="http://schemas.microsoft.com/office/drawing/2016/5/13/chartex" xmlns:cx8="http://schemas.microsoft.com/office/drawing/2016/5/14/chartex" xmlns:mc="http://schemas.openxmlformats.org/markup-compatibility/2006" xmlns:aink="http://schemas.microsoft.com/office/drawing/2016/ink" xmlns:am3d="http://schemas.microsoft.com/office/drawing/2017/model3d" xmlns:o="urn:schemas-microsoft-com:office:office" xmlns:oel="http://schemas.microsoft.com/office/2019/extlst" xmlns:r="http://schemas.openxmlformats.org/officeDocument/2006/relationships" xmlns:m="http://schemas.openxmlformats.org/officeDocument/2006/math" xmlns:v="urn:schemas-microsoft-com:vml" xmlns:wp14="http://schemas.microsoft.com/office/word/2010/wordprocessingDrawing" xmlns:wp="http://schemas.openxmlformats.org/drawingml/2006/wordprocessingDrawing" xmlns:w10="urn:schemas-microsoft-com:office:word" xmlns:w="http://schemas.openxmlformats.org/wordprocessingml/2006/main" xmlns:w14="http://schemas.microsoft.com/office/word/2010/wordml" xmlns:w15="http://schemas.microsoft.com/office/word/2012/wordml" xmlns:w16cex="http://schemas.microsoft.com/office/word/2018/wordml/cex" xmlns:w16cid="http://schemas.microsoft.com/office/word/2016/wordml/cid" xmlns:w16="http://schemas.microsoft.com/office/word/2018/wordml" xmlns:w16du="http://schemas.microsoft.com/office/word/2023/wordml/word16du" xmlns:w16sdtdh="http://schemas.microsoft.com/office/word/2020/wordml/sdtdatahash" xmlns:w16sdtfl="http://schemas.microsoft.com/office/word/2024/wordml/sdtformatlock" xmlns:w16se="http://schemas.microsoft.com/office/word/2015/wordml/symex" xmlns:wpg="http://schemas.microsoft.com/office/word/2010/wordprocessingGroup" xmlns:wpi="http://schemas.microsoft.com/office/word/2010/wordprocessingInk" xmlns:wne="http://schemas.microsoft.com/office/word/2006/wordml" xmlns:wps="http://schemas.microsoft.com/office/word/2010/wordprocessingShape" mc:Ignorable="w14 w15 w16se w16cid w16 w16cex w16sdtdh w16sdtfl w16du wp14">
   <w:body>
     <w:p>
       <w:pPr>
@@ -61,7 +61,21 @@
           <w:lang w:val="es-CO"/>
         </w:rPr>
         <w:br/>
-        <w:t>Fecha: Noviembre 2025</w:t>
+        <w:t xml:space="preserve">Fecha: </w:t>
+      </w:r>
+      <w:proofErr w:type="gramStart"/>
+      <w:r>
+        <w:rPr>
+          <w:lang w:val="es-CO"/>
+        </w:rPr>
+        <w:t>Noviembre</w:t>
+      </w:r>
+      <w:proofErr w:type="gramEnd"/>
+      <w:r>
+        <w:rPr>
+          <w:lang w:val="es-CO"/>
+        </w:rPr>
+        <w:t xml:space="preserve"> 2025</w:t>
       </w:r>
       <w:r>
         <w:rPr>
@@ -70,6 +84,56 @@
         <w:br/>
         <w:t>Autor: Yeison Micolta R.</w:t>
       </w:r>
+    </w:p>
+    <w:p>
+      <w:pPr>
+        <w:jc w:val="center"/>
+        <w:rPr>
+          <w:lang w:val="es-CO"/>
+        </w:rPr>
+      </w:pPr>
+      <w:r>
+        <w:rPr>
+          <w:lang w:val="es-CO"/>
+        </w:rPr>
+        <w:t>Yesenia Castro A.</w:t>
+      </w:r>
+    </w:p>
+    <w:p>
+      <w:pPr>
+        <w:jc w:val="center"/>
+        <w:rPr>
+          <w:lang w:val="es-CO"/>
+        </w:rPr>
+      </w:pPr>
+      <w:r>
+        <w:rPr>
+          <w:lang w:val="es-CO"/>
+        </w:rPr>
+        <w:t xml:space="preserve">Alejandra Arteaga </w:t>
+      </w:r>
+    </w:p>
+    <w:p>
+      <w:pPr>
+        <w:jc w:val="center"/>
+        <w:rPr>
+          <w:lang w:val="es-CO"/>
+        </w:rPr>
+      </w:pPr>
+      <w:r>
+        <w:rPr>
+          <w:lang w:val="es-CO"/>
+        </w:rPr>
+        <w:t xml:space="preserve">Harold </w:t>
+      </w:r>
+      <w:proofErr w:type="spellStart"/>
+      <w:r>
+        <w:rPr>
+          <w:lang w:val="es-CO"/>
+        </w:rPr>
+        <w:t>Avila</w:t>
+      </w:r>
+      <w:proofErr w:type="spellEnd"/>
       <w:r>
         <w:rPr>
           <w:lang w:val="es-CO"/>
@@ -250,7 +314,55 @@
               <w:rPr>
                 <w:lang w:val="es-CO"/>
               </w:rPr>
-              <w:t>Almacenar información de los profesores: nombre, correo, teléfono, dirección, título académico, especialidad, fecha de ingreso y estado.</w:t>
+              <w:t>Almacenar información de los profesores: nombre, correo, teléfono, dirección, título académico, especialidad, fecha de ingreso</w:t>
+            </w:r>
+            <w:r>
+              <w:rPr>
+                <w:lang w:val="es-CO"/>
+              </w:rPr>
+              <w:t xml:space="preserve">, </w:t>
+            </w:r>
+            <w:r>
+              <w:rPr>
+                <w:lang w:val="es-CO"/>
+              </w:rPr>
+              <w:t>fecha</w:t>
+            </w:r>
+            <w:r>
+              <w:rPr>
+                <w:lang w:val="es-CO"/>
+              </w:rPr>
+              <w:t xml:space="preserve"> </w:t>
+            </w:r>
+            <w:r>
+              <w:rPr>
+                <w:lang w:val="es-CO"/>
+              </w:rPr>
+              <w:t>cambio</w:t>
+            </w:r>
+            <w:r>
+              <w:rPr>
+                <w:lang w:val="es-CO"/>
+              </w:rPr>
+              <w:t xml:space="preserve"> de </w:t>
+            </w:r>
+            <w:r>
+              <w:rPr>
+                <w:lang w:val="es-CO"/>
+              </w:rPr>
+              <w:t>estado</w:t>
+            </w:r>
+            <w:r>
+              <w:rPr>
+                <w:lang w:val="es-CO"/>
+              </w:rPr>
+              <w:t xml:space="preserve"> </w:t>
+            </w:r>
+            <w:r>
+              <w:rPr>
+                <w:lang w:val="es-CO"/>
+              </w:rPr>
+              <w:t>y estado.</w:t>
             </w:r>
           </w:p>
         </w:tc>
@@ -285,7 +397,25 @@
               <w:rPr>
                 <w:lang w:val="es-CO"/>
               </w:rPr>
-              <w:t>El correo del profesor debe ser único.</w:t>
+              <w:t xml:space="preserve">La identificación y el correo </w:t>
+            </w:r>
+            <w:r>
+              <w:rPr>
+                <w:lang w:val="es-CO"/>
+              </w:rPr>
+              <w:t>del profesor debe ser únic</w:t>
+            </w:r>
+            <w:r>
+              <w:rPr>
+                <w:lang w:val="es-CO"/>
+              </w:rPr>
+              <w:t>o</w:t>
+            </w:r>
+            <w:r>
+              <w:rPr>
+                <w:lang w:val="es-CO"/>
+              </w:rPr>
+              <w:t>.</w:t>
             </w:r>
           </w:p>
         </w:tc>
@@ -320,7 +450,7 @@
               <w:rPr>
                 <w:lang w:val="es-CO"/>
               </w:rPr>
-              <w:t>Asignar profesores como directores de grado o responsables de asignaturas.</w:t>
+              <w:t>Asignar profesores como directores de grado.</w:t>
             </w:r>
           </w:p>
         </w:tc>
@@ -409,7 +539,19 @@
               <w:rPr>
                 <w:lang w:val="es-CO"/>
               </w:rPr>
-              <w:t>Registrar niveles académicos (primaria, secundaria, etc.).</w:t>
+              <w:t xml:space="preserve">Registrar niveles académicos (primaria, secundaria, </w:t>
+            </w:r>
+            <w:r>
+              <w:rPr>
+                <w:lang w:val="es-CO"/>
+              </w:rPr>
+              <w:t>Bachillerato</w:t>
+            </w:r>
+            <w:r>
+              <w:rPr>
+                <w:lang w:val="es-CO"/>
+              </w:rPr>
+              <w:t>).</w:t>
             </w:r>
           </w:p>
         </w:tc>
@@ -682,7 +824,39 @@
           </w:p>
         </w:tc>
       </w:tr>
+      <w:tr>
+        <w:trPr>
+          <w:cnfStyle w:val="000000010000" w:firstRow="0" w:lastRow="0" w:firstColumn="0" w:lastColumn="0" w:oddVBand="0" w:evenVBand="0" w:oddHBand="0" w:evenHBand="1" w:firstRowFirstColumn="0" w:firstRowLastColumn="0" w:lastRowFirstColumn="0" w:lastRowLastColumn="0"/>
+        </w:trPr>
+        <w:tc>
+          <w:tcPr>
+            <w:cnfStyle w:val="001000000000" w:firstRow="0" w:lastRow="0" w:firstColumn="1" w:lastColumn="0" w:oddVBand="0" w:evenVBand="0" w:oddHBand="0" w:evenHBand="0" w:firstRowFirstColumn="0" w:firstRowLastColumn="0" w:lastRowFirstColumn="0" w:lastRowLastColumn="0"/>
+            <w:tcW w:w="4320" w:type="dxa"/>
+          </w:tcPr>
+          <w:p/>
+        </w:tc>
+        <w:tc>
+          <w:tcPr>
+            <w:tcW w:w="4320" w:type="dxa"/>
+          </w:tcPr>
+          <w:p>
+            <w:pPr>
+              <w:cnfStyle w:val="000000010000" w:firstRow="0" w:lastRow="0" w:firstColumn="0" w:lastColumn="0" w:oddVBand="0" w:evenVBand="0" w:oddHBand="0" w:evenHBand="1" w:firstRowFirstColumn="0" w:firstRowLastColumn="0" w:lastRowFirstColumn="0" w:lastRowLastColumn="0"/>
+              <w:rPr>
+                <w:lang w:val="es-CO"/>
+              </w:rPr>
+            </w:pPr>
+          </w:p>
+        </w:tc>
+      </w:tr>
     </w:tbl>
+    <w:p>
+      <w:pPr>
+        <w:pStyle w:val="Ttulo2"/>
+      </w:pPr>
+    </w:p>
+    <w:p/>
+    <w:p/>
     <w:p>
       <w:pPr>
         <w:pStyle w:val="Ttulo2"/>
@@ -821,7 +995,6 @@
           </w:tcPr>
           <w:p>
             <w:r>
-              <w:lastRenderedPageBreak/>
               <w:t>RF-14</w:t>
             </w:r>
           </w:p>
@@ -1231,7 +1404,49 @@
               <w:rPr>
                 <w:lang w:val="es-CO"/>
               </w:rPr>
-              <w:t>Registrar fechas de ingreso y matrícula.</w:t>
+              <w:t>Registrar fechas de ingreso</w:t>
+            </w:r>
+            <w:r>
+              <w:rPr>
+                <w:lang w:val="es-CO"/>
+              </w:rPr>
+              <w:t xml:space="preserve">, </w:t>
+            </w:r>
+            <w:r>
+              <w:rPr>
+                <w:lang w:val="es-CO"/>
+              </w:rPr>
+              <w:t>fecha</w:t>
+            </w:r>
+            <w:r>
+              <w:rPr>
+                <w:lang w:val="es-CO"/>
+              </w:rPr>
+              <w:t xml:space="preserve"> </w:t>
+            </w:r>
+            <w:r>
+              <w:rPr>
+                <w:lang w:val="es-CO"/>
+              </w:rPr>
+              <w:t>cambio</w:t>
+            </w:r>
+            <w:r>
+              <w:rPr>
+                <w:lang w:val="es-CO"/>
+              </w:rPr>
+              <w:t xml:space="preserve"> de </w:t>
+            </w:r>
+            <w:r>
+              <w:rPr>
+                <w:lang w:val="es-CO"/>
+              </w:rPr>
+              <w:t>estado</w:t>
+            </w:r>
+            <w:r>
+              <w:rPr>
+                <w:lang w:val="es-CO"/>
+              </w:rPr>
+              <w:t xml:space="preserve"> y matrícula.</w:t>
             </w:r>
           </w:p>
         </w:tc>
@@ -1266,7 +1481,25 @@
               <w:rPr>
                 <w:lang w:val="es-CO"/>
               </w:rPr>
-              <w:t>Controlar el estado del estudiante (activo, inactivo, retirado).</w:t>
+              <w:t xml:space="preserve">Controlar el estado del estudiante (activo, inactivo, </w:t>
+            </w:r>
+            <w:r>
+              <w:rPr>
+                <w:lang w:val="es-CO"/>
+              </w:rPr>
+              <w:t>retirado</w:t>
+            </w:r>
+            <w:r>
+              <w:rPr>
+                <w:lang w:val="es-CO"/>
+              </w:rPr>
+              <w:t>, egresado, fallecido, expulsado</w:t>
+            </w:r>
+            <w:r>
+              <w:rPr>
+                <w:lang w:val="es-CO"/>
+              </w:rPr>
+              <w:t>).</w:t>
             </w:r>
           </w:p>
         </w:tc>
@@ -1592,7 +1825,31 @@
               <w:rPr>
                 <w:lang w:val="es-CO"/>
               </w:rPr>
-              <w:t>Validar que las calificaciones estén entre 0 y 10 con dos decimales.</w:t>
+              <w:t xml:space="preserve">Validar que las calificaciones estén entre </w:t>
+            </w:r>
+            <w:r>
+              <w:rPr>
+                <w:lang w:val="es-CO"/>
+              </w:rPr>
+              <w:t>0</w:t>
+            </w:r>
+            <w:r>
+              <w:rPr>
+                <w:lang w:val="es-CO"/>
+              </w:rPr>
+              <w:t xml:space="preserve"> y </w:t>
+            </w:r>
+            <w:r>
+              <w:rPr>
+                <w:lang w:val="es-CO"/>
+              </w:rPr>
+              <w:t>5</w:t>
+            </w:r>
+            <w:r>
+              <w:rPr>
+                <w:lang w:val="es-CO"/>
+              </w:rPr>
+              <w:t xml:space="preserve"> con dos decimales.</w:t>
             </w:r>
           </w:p>
         </w:tc>
@@ -1674,7 +1931,6 @@
       </w:pPr>
       <w:proofErr w:type="spellStart"/>
       <w:r>
-        <w:lastRenderedPageBreak/>
         <w:t>Módulo</w:t>
       </w:r>
       <w:proofErr w:type="spellEnd"/>
@@ -1888,7 +2144,6 @@
         <w:pStyle w:val="Ttulo1"/>
       </w:pPr>
       <w:r>
-        <w:lastRenderedPageBreak/>
         <w:t xml:space="preserve">3. </w:t>
       </w:r>
       <w:proofErr w:type="spellStart"/>
@@ -2264,7 +2519,6 @@
         <w:rPr>
           <w:lang w:val="es-CO"/>
         </w:rPr>
-        <w:lastRenderedPageBreak/>
         <w:t>Casos de Uso del Sistema de Gestión Académica</w:t>
       </w:r>
     </w:p>
@@ -2761,7 +3015,6 @@
           <w:bCs/>
           <w:lang w:val="es-CO"/>
         </w:rPr>
-        <w:lastRenderedPageBreak/>
         <w:t>Actor:</w:t>
       </w:r>
       <w:r>
@@ -3319,7 +3572,6 @@
           <w:bCs/>
           <w:lang w:val="es-CO"/>
         </w:rPr>
-        <w:lastRenderedPageBreak/>
         <w:t>Descripción:</w:t>
       </w:r>
       <w:r>
@@ -3758,7 +4010,7 @@
         <w:rPr>
           <w:lang w:val="es-CO"/>
         </w:rPr>
-        <w:t xml:space="preserve"> Administrador / Profesor</w:t>
+        <w:t xml:space="preserve"> Administrador </w:t>
       </w:r>
     </w:p>
     <w:p>
@@ -3850,7 +4102,6 @@
           <w:bCs/>
           <w:lang w:val="es-CO"/>
         </w:rPr>
-        <w:lastRenderedPageBreak/>
         <w:t>CU-012: Consultar Horario</w:t>
       </w:r>
     </w:p>
@@ -4402,7 +4653,6 @@
           <w:bCs/>
           <w:lang w:val="es-CO"/>
         </w:rPr>
-        <w:lastRenderedPageBreak/>
         <w:t>Postcondición:</w:t>
       </w:r>
       <w:r>
@@ -4543,7 +4793,19 @@
         <w:rPr>
           <w:lang w:val="es-CO"/>
         </w:rPr>
-        <w:t xml:space="preserve"> Estudiante / Acudiente</w:t>
+        <w:t xml:space="preserve"> Estudiante / </w:t>
+      </w:r>
+      <w:r>
+        <w:rPr>
+          <w:lang w:val="es-CO"/>
+        </w:rPr>
+        <w:t>Profesor</w:t>
+      </w:r>
+      <w:r>
+        <w:rPr>
+          <w:lang w:val="es-CO"/>
+        </w:rPr>
+        <w:t xml:space="preserve">/ Administrador </w:t>
       </w:r>
     </w:p>
     <w:p>
@@ -4828,6 +5090,49 @@
           <w:bCs/>
           <w:lang w:val="es-CO"/>
         </w:rPr>
+        <w:t>Precondición:</w:t>
+      </w:r>
+      <w:r>
+        <w:rPr>
+          <w:lang w:val="es-CO"/>
+        </w:rPr>
+        <w:t xml:space="preserve"> </w:t>
+      </w:r>
+      <w:r>
+        <w:rPr>
+          <w:lang w:val="es-CO"/>
+        </w:rPr>
+        <w:t xml:space="preserve"> </w:t>
+      </w:r>
+      <w:r>
+        <w:rPr>
+          <w:lang w:val="es-CO"/>
+        </w:rPr>
+        <w:t xml:space="preserve">El usuario debe estar </w:t>
+      </w:r>
+      <w:r>
+        <w:rPr>
+          <w:lang w:val="es-CO"/>
+        </w:rPr>
+        <w:t>registrado.</w:t>
+      </w:r>
+    </w:p>
+    <w:p>
+      <w:pPr>
+        <w:numPr>
+          <w:ilvl w:val="0"/>
+          <w:numId w:val="29"/>
+        </w:numPr>
+        <w:rPr>
+          <w:lang w:val="es-CO"/>
+        </w:rPr>
+      </w:pPr>
+      <w:r>
+        <w:rPr>
+          <w:b/>
+          <w:bCs/>
+          <w:lang w:val="es-CO"/>
+        </w:rPr>
         <w:t>Postcondición:</w:t>
       </w:r>
       <w:r>
@@ -4920,6 +5225,49 @@
           <w:bCs/>
           <w:lang w:val="es-CO"/>
         </w:rPr>
+        <w:t>Precondición:</w:t>
+      </w:r>
+      <w:r>
+        <w:rPr>
+          <w:lang w:val="es-CO"/>
+        </w:rPr>
+        <w:t xml:space="preserve"> </w:t>
+      </w:r>
+      <w:r>
+        <w:rPr>
+          <w:lang w:val="es-CO"/>
+        </w:rPr>
+        <w:t xml:space="preserve"> </w:t>
+      </w:r>
+      <w:r>
+        <w:rPr>
+          <w:lang w:val="es-CO"/>
+        </w:rPr>
+        <w:t xml:space="preserve">El usuario debe estar </w:t>
+      </w:r>
+      <w:r>
+        <w:rPr>
+          <w:lang w:val="es-CO"/>
+        </w:rPr>
+        <w:t>registrado.</w:t>
+      </w:r>
+    </w:p>
+    <w:p>
+      <w:pPr>
+        <w:numPr>
+          <w:ilvl w:val="0"/>
+          <w:numId w:val="30"/>
+        </w:numPr>
+        <w:rPr>
+          <w:lang w:val="es-CO"/>
+        </w:rPr>
+      </w:pPr>
+      <w:r>
+        <w:rPr>
+          <w:b/>
+          <w:bCs/>
+          <w:lang w:val="es-CO"/>
+        </w:rPr>
         <w:t>Postcondición:</w:t>
       </w:r>
       <w:r>
@@ -4987,7 +5335,6 @@
           <w:bCs/>
           <w:lang w:val="es-CO"/>
         </w:rPr>
-        <w:lastRenderedPageBreak/>
         <w:t>Descripción:</w:t>
       </w:r>
       <w:r>
@@ -5093,7 +5440,7 @@
         <w:rPr>
           <w:lang w:val="es-CO"/>
         </w:rPr>
-        <w:t xml:space="preserve"> Profesor / Administrador</w:t>
+        <w:t xml:space="preserve"> Administrador</w:t>
       </w:r>
     </w:p>
     <w:p>
@@ -5143,7 +5490,7 @@
         <w:rPr>
           <w:lang w:val="es-CO"/>
         </w:rPr>
-        <w:t xml:space="preserve"> Reporte generado en PDF o Excel.</w:t>
+        <w:t xml:space="preserve"> Reporte generado en PDF.</w:t>
       </w:r>
     </w:p>
     <w:p>
@@ -5185,7 +5532,7 @@
         <w:rPr>
           <w:lang w:val="es-CO"/>
         </w:rPr>
-        <w:t xml:space="preserve"> Profesor / Administrador</w:t>
+        <w:t xml:space="preserve"> Profesor </w:t>
       </w:r>
     </w:p>
     <w:p>
@@ -5219,6 +5566,67 @@
           <w:lang w:val="es-CO"/>
         </w:rPr>
       </w:pPr>
+    </w:p>
+    <w:p>
+      <w:pPr>
+        <w:rPr>
+          <w:lang w:val="es-CO"/>
+        </w:rPr>
+      </w:pPr>
+    </w:p>
+    <w:p>
+      <w:pPr>
+        <w:rPr>
+          <w:lang w:val="es-CO"/>
+        </w:rPr>
+      </w:pPr>
+      <w:r>
+        <w:rPr>
+          <w:lang w:val="es-CO"/>
+        </w:rPr>
+        <w:t>V2_-&gt; integrar funciones para cada uno de los roles que existen dentro de la institución educativa</w:t>
+      </w:r>
+    </w:p>
+    <w:p>
+      <w:pPr>
+        <w:rPr>
+          <w:lang w:val="es-CO"/>
+        </w:rPr>
+      </w:pPr>
+      <w:r>
+        <w:rPr>
+          <w:lang w:val="es-CO"/>
+        </w:rPr>
+        <w:t xml:space="preserve"> V3-&gt; Integrar un </w:t>
+      </w:r>
+      <w:proofErr w:type="spellStart"/>
+      <w:r>
+        <w:rPr>
+          <w:lang w:val="es-CO"/>
+        </w:rPr>
+        <w:t>modulo</w:t>
+      </w:r>
+      <w:proofErr w:type="spellEnd"/>
+      <w:r>
+        <w:rPr>
+          <w:lang w:val="es-CO"/>
+        </w:rPr>
+        <w:t xml:space="preserve"> de inteligencia artificial para que apoye tanto a estudiante como a docentes en dar soluciones en las dificultades que presenten en áreas </w:t>
+      </w:r>
+      <w:proofErr w:type="spellStart"/>
+      <w:r>
+        <w:rPr>
+          <w:lang w:val="es-CO"/>
+        </w:rPr>
+        <w:t>especificas</w:t>
+      </w:r>
+      <w:proofErr w:type="spellEnd"/>
+      <w:r>
+        <w:rPr>
+          <w:lang w:val="es-CO"/>
+        </w:rPr>
+        <w:t xml:space="preserve"> como también integrar diferentes funcionalidades de chats inteligentes para cada rol (pulir la idea) </w:t>
+      </w:r>
     </w:p>
     <w:sectPr>
       <w:pgSz w:w="12240" w:h="15840"/>
@@ -5231,7 +5639,7 @@
 </file>
 
 <file path=word/numbering.xml><?xml version="1.0" encoding="utf-8"?>
-<w:numbering xmlns:wpc="http://schemas.microsoft.com/office/word/2010/wordprocessingCanvas" xmlns:cx="http://schemas.microsoft.com/office/drawing/2014/chartex" xmlns:cx1="http://schemas.microsoft.com/office/drawing/2015/9/8/chartex" xmlns:cx2="http://schemas.microsoft.com/office/drawing/2015/10/21/chartex" xmlns:cx3="http://schemas.microsoft.com/office/drawing/2016/5/9/chartex" xmlns:cx4="http://schemas.microsoft.com/office/drawing/2016/5/10/chartex" xmlns:cx5="http://schemas.microsoft.com/office/drawing/2016/5/11/chartex" xmlns:cx6="http://schemas.microsoft.com/office/drawing/2016/5/12/chartex" xmlns:cx7="http://schemas.microsoft.com/office/drawing/2016/5/13/chartex" xmlns:cx8="http://schemas.microsoft.com/office/drawing/2016/5/14/chartex" xmlns:mc="http://schemas.openxmlformats.org/markup-compatibility/2006" xmlns:aink="http://schemas.microsoft.com/office/drawing/2016/ink" xmlns:am3d="http://schemas.microsoft.com/office/drawing/2017/model3d" xmlns:o="urn:schemas-microsoft-com:office:office" xmlns:oel="http://schemas.microsoft.com/office/2019/extlst" xmlns:r="http://schemas.openxmlformats.org/officeDocument/2006/relationships" xmlns:m="http://schemas.openxmlformats.org/officeDocument/2006/math" xmlns:v="urn:schemas-microsoft-com:vml" xmlns:wp14="http://schemas.microsoft.com/office/word/2010/wordprocessingDrawing" xmlns:wp="http://schemas.openxmlformats.org/drawingml/2006/wordprocessingDrawing" xmlns:w10="urn:schemas-microsoft-com:office:word" xmlns:w="http://schemas.openxmlformats.org/wordprocessingml/2006/main" xmlns:w14="http://schemas.microsoft.com/office/word/2010/wordml" xmlns:w15="http://schemas.microsoft.com/office/word/2012/wordml" xmlns:w16cex="http://schemas.microsoft.com/office/word/2018/wordml/cex" xmlns:w16cid="http://schemas.microsoft.com/office/word/2016/wordml/cid" xmlns:w16="http://schemas.microsoft.com/office/word/2018/wordml" xmlns:w16sdtdh="http://schemas.microsoft.com/office/word/2020/wordml/sdtdatahash" xmlns:w16se="http://schemas.microsoft.com/office/word/2015/wordml/symex" xmlns:wpg="http://schemas.microsoft.com/office/word/2010/wordprocessingGroup" xmlns:wpi="http://schemas.microsoft.com/office/word/2010/wordprocessingInk" xmlns:wne="http://schemas.microsoft.com/office/word/2006/wordml" xmlns:wps="http://schemas.microsoft.com/office/word/2010/wordprocessingShape" mc:Ignorable="w14 w15 w16se w16cid w16 w16cex w16sdtdh wp14">
+<w:numbering xmlns:wpc="http://schemas.microsoft.com/office/word/2010/wordprocessingCanvas" xmlns:cx="http://schemas.microsoft.com/office/drawing/2014/chartex" xmlns:cx1="http://schemas.microsoft.com/office/drawing/2015/9/8/chartex" xmlns:cx2="http://schemas.microsoft.com/office/drawing/2015/10/21/chartex" xmlns:cx3="http://schemas.microsoft.com/office/drawing/2016/5/9/chartex" xmlns:cx4="http://schemas.microsoft.com/office/drawing/2016/5/10/chartex" xmlns:cx5="http://schemas.microsoft.com/office/drawing/2016/5/11/chartex" xmlns:cx6="http://schemas.microsoft.com/office/drawing/2016/5/12/chartex" xmlns:cx7="http://schemas.microsoft.com/office/drawing/2016/5/13/chartex" xmlns:cx8="http://schemas.microsoft.com/office/drawing/2016/5/14/chartex" xmlns:mc="http://schemas.openxmlformats.org/markup-compatibility/2006" xmlns:aink="http://schemas.microsoft.com/office/drawing/2016/ink" xmlns:am3d="http://schemas.microsoft.com/office/drawing/2017/model3d" xmlns:o="urn:schemas-microsoft-com:office:office" xmlns:oel="http://schemas.microsoft.com/office/2019/extlst" xmlns:r="http://schemas.openxmlformats.org/officeDocument/2006/relationships" xmlns:m="http://schemas.openxmlformats.org/officeDocument/2006/math" xmlns:v="urn:schemas-microsoft-com:vml" xmlns:wp14="http://schemas.microsoft.com/office/word/2010/wordprocessingDrawing" xmlns:wp="http://schemas.openxmlformats.org/drawingml/2006/wordprocessingDrawing" xmlns:w10="urn:schemas-microsoft-com:office:word" xmlns:w="http://schemas.openxmlformats.org/wordprocessingml/2006/main" xmlns:w14="http://schemas.microsoft.com/office/word/2010/wordml" xmlns:w15="http://schemas.microsoft.com/office/word/2012/wordml" xmlns:w16cex="http://schemas.microsoft.com/office/word/2018/wordml/cex" xmlns:w16cid="http://schemas.microsoft.com/office/word/2016/wordml/cid" xmlns:w16="http://schemas.microsoft.com/office/word/2018/wordml" xmlns:w16du="http://schemas.microsoft.com/office/word/2023/wordml/word16du" xmlns:w16sdtdh="http://schemas.microsoft.com/office/word/2020/wordml/sdtdatahash" xmlns:w16sdtfl="http://schemas.microsoft.com/office/word/2024/wordml/sdtformatlock" xmlns:w16se="http://schemas.microsoft.com/office/word/2015/wordml/symex" xmlns:wpg="http://schemas.microsoft.com/office/word/2010/wordprocessingGroup" xmlns:wpi="http://schemas.microsoft.com/office/word/2010/wordprocessingInk" xmlns:wne="http://schemas.microsoft.com/office/word/2006/wordml" xmlns:wps="http://schemas.microsoft.com/office/word/2010/wordprocessingShape" mc:Ignorable="w14 w15 w16se w16cid w16 w16cex w16sdtdh w16sdtfl w16du wp14">
   <w:abstractNum w:abstractNumId="0" w15:restartNumberingAfterBreak="0">
     <w:nsid w:val="FFFFFF7C"/>
     <w:multiLevelType w:val="singleLevel"/>
@@ -9074,7 +9482,7 @@
 </file>
 
 <file path=word/styles.xml><?xml version="1.0" encoding="utf-8"?>
-<w:styles xmlns:mc="http://schemas.openxmlformats.org/markup-compatibility/2006" xmlns:r="http://schemas.openxmlformats.org/officeDocument/2006/relationships" xmlns:w="http://schemas.openxmlformats.org/wordprocessingml/2006/main" xmlns:w14="http://schemas.microsoft.com/office/word/2010/wordml" xmlns:w15="http://schemas.microsoft.com/office/word/2012/wordml" xmlns:w16cex="http://schemas.microsoft.com/office/word/2018/wordml/cex" xmlns:w16cid="http://schemas.microsoft.com/office/word/2016/wordml/cid" xmlns:w16="http://schemas.microsoft.com/office/word/2018/wordml" xmlns:w16sdtdh="http://schemas.microsoft.com/office/word/2020/wordml/sdtdatahash" xmlns:w16se="http://schemas.microsoft.com/office/word/2015/wordml/symex" mc:Ignorable="w14 w15 w16se w16cid w16 w16cex w16sdtdh">
+<w:styles xmlns:mc="http://schemas.openxmlformats.org/markup-compatibility/2006" xmlns:r="http://schemas.openxmlformats.org/officeDocument/2006/relationships" xmlns:w="http://schemas.openxmlformats.org/wordprocessingml/2006/main" xmlns:w14="http://schemas.microsoft.com/office/word/2010/wordml" xmlns:w15="http://schemas.microsoft.com/office/word/2012/wordml" xmlns:w16cex="http://schemas.microsoft.com/office/word/2018/wordml/cex" xmlns:w16cid="http://schemas.microsoft.com/office/word/2016/wordml/cid" xmlns:w16="http://schemas.microsoft.com/office/word/2018/wordml" xmlns:w16du="http://schemas.microsoft.com/office/word/2023/wordml/word16du" xmlns:w16sdtdh="http://schemas.microsoft.com/office/word/2020/wordml/sdtdatahash" xmlns:w16sdtfl="http://schemas.microsoft.com/office/word/2024/wordml/sdtformatlock" xmlns:w16se="http://schemas.microsoft.com/office/word/2015/wordml/symex" mc:Ignorable="w14 w15 w16se w16cid w16 w16cex w16sdtdh w16sdtfl w16du">
   <w:docDefaults>
     <w:rPrDefault>
       <w:rPr>
@@ -9358,11 +9766,6 @@
     <w:lsdException w:name="Book Title" w:uiPriority="33" w:qFormat="1"/>
     <w:lsdException w:name="Bibliography" w:semiHidden="1" w:uiPriority="37" w:unhideWhenUsed="1"/>
     <w:lsdException w:name="TOC Heading" w:semiHidden="1" w:uiPriority="39" w:unhideWhenUsed="1" w:qFormat="1"/>
-    <w:lsdException w:name="Plain Table 5" w:semiHidden="1" w:unhideWhenUsed="1"/>
-    <w:lsdException w:name="Grid Table Light" w:semiHidden="1" w:unhideWhenUsed="1"/>
-    <w:lsdException w:name="Grid Table 1 Light" w:semiHidden="1" w:unhideWhenUsed="1"/>
-    <w:lsdException w:name="Grid Table 2" w:semiHidden="1" w:unhideWhenUsed="1"/>
-    <w:lsdException w:name="Grid Table 3" w:semiHidden="1" w:unhideWhenUsed="1"/>
     <w:lsdException w:name="Grid Table 4" w:uiPriority="49"/>
     <w:lsdException w:name="Grid Table 5 Dark" w:uiPriority="50"/>
     <w:lsdException w:name="Grid Table 6 Colorful" w:uiPriority="51"/>
@@ -9467,7 +9870,7 @@
   <w:style w:type="paragraph" w:default="1" w:styleId="Normal">
     <w:name w:val="Normal"/>
     <w:qFormat/>
-    <w:rsid w:val="00FC693F"/>
+    <w:rsid w:val="00982D68"/>
   </w:style>
   <w:style w:type="paragraph" w:styleId="Ttulo1">
     <w:name w:val="heading 1"/>
@@ -9681,6 +10084,7 @@
   <w:style w:type="character" w:default="1" w:styleId="Fuentedeprrafopredeter">
     <w:name w:val="Default Paragraph Font"/>
     <w:uiPriority w:val="1"/>
+    <w:semiHidden/>
     <w:unhideWhenUsed/>
   </w:style>
   <w:style w:type="table" w:default="1" w:styleId="Tablanormal">

</xml_diff>

<commit_message>
Actualización de requisitos y casos de uso
</commit_message>
<xml_diff>
--- a/Requisitos Sistema y Casos de Uso.docx
+++ b/Requisitos Sistema y Casos de Uso.docx
@@ -1,6 +1,6 @@
 
 <file path=word/document.xml><?xml version="1.0" encoding="utf-8"?>
-<w:document xmlns:wpc="http://schemas.microsoft.com/office/word/2010/wordprocessingCanvas" xmlns:cx="http://schemas.microsoft.com/office/drawing/2014/chartex" xmlns:cx1="http://schemas.microsoft.com/office/drawing/2015/9/8/chartex" xmlns:cx2="http://schemas.microsoft.com/office/drawing/2015/10/21/chartex" xmlns:cx3="http://schemas.microsoft.com/office/drawing/2016/5/9/chartex" xmlns:cx4="http://schemas.microsoft.com/office/drawing/2016/5/10/chartex" xmlns:cx5="http://schemas.microsoft.com/office/drawing/2016/5/11/chartex" xmlns:cx6="http://schemas.microsoft.com/office/drawing/2016/5/12/chartex" xmlns:cx7="http://schemas.microsoft.com/office/drawing/2016/5/13/chartex" xmlns:cx8="http://schemas.microsoft.com/office/drawing/2016/5/14/chartex" xmlns:mc="http://schemas.openxmlformats.org/markup-compatibility/2006" xmlns:aink="http://schemas.microsoft.com/office/drawing/2016/ink" xmlns:am3d="http://schemas.microsoft.com/office/drawing/2017/model3d" xmlns:o="urn:schemas-microsoft-com:office:office" xmlns:oel="http://schemas.microsoft.com/office/2019/extlst" xmlns:r="http://schemas.openxmlformats.org/officeDocument/2006/relationships" xmlns:m="http://schemas.openxmlformats.org/officeDocument/2006/math" xmlns:v="urn:schemas-microsoft-com:vml" xmlns:wp14="http://schemas.microsoft.com/office/word/2010/wordprocessingDrawing" xmlns:wp="http://schemas.openxmlformats.org/drawingml/2006/wordprocessingDrawing" xmlns:w10="urn:schemas-microsoft-com:office:word" xmlns:w="http://schemas.openxmlformats.org/wordprocessingml/2006/main" xmlns:w14="http://schemas.microsoft.com/office/word/2010/wordml" xmlns:w15="http://schemas.microsoft.com/office/word/2012/wordml" xmlns:w16cex="http://schemas.microsoft.com/office/word/2018/wordml/cex" xmlns:w16cid="http://schemas.microsoft.com/office/word/2016/wordml/cid" xmlns:w16="http://schemas.microsoft.com/office/word/2018/wordml" xmlns:w16sdtdh="http://schemas.microsoft.com/office/word/2020/wordml/sdtdatahash" xmlns:w16se="http://schemas.microsoft.com/office/word/2015/wordml/symex" xmlns:wpg="http://schemas.microsoft.com/office/word/2010/wordprocessingGroup" xmlns:wpi="http://schemas.microsoft.com/office/word/2010/wordprocessingInk" xmlns:wne="http://schemas.microsoft.com/office/word/2006/wordml" xmlns:wps="http://schemas.microsoft.com/office/word/2010/wordprocessingShape" mc:Ignorable="w14 w15 w16se w16cid w16 w16cex w16sdtdh wp14">
+<w:document xmlns:wpc="http://schemas.microsoft.com/office/word/2010/wordprocessingCanvas" xmlns:cx="http://schemas.microsoft.com/office/drawing/2014/chartex" xmlns:cx1="http://schemas.microsoft.com/office/drawing/2015/9/8/chartex" xmlns:cx2="http://schemas.microsoft.com/office/drawing/2015/10/21/chartex" xmlns:cx3="http://schemas.microsoft.com/office/drawing/2016/5/9/chartex" xmlns:cx4="http://schemas.microsoft.com/office/drawing/2016/5/10/chartex" xmlns:cx5="http://schemas.microsoft.com/office/drawing/2016/5/11/chartex" xmlns:cx6="http://schemas.microsoft.com/office/drawing/2016/5/12/chartex" xmlns:cx7="http://schemas.microsoft.com/office/drawing/2016/5/13/chartex" xmlns:cx8="http://schemas.microsoft.com/office/drawing/2016/5/14/chartex" xmlns:mc="http://schemas.openxmlformats.org/markup-compatibility/2006" xmlns:aink="http://schemas.microsoft.com/office/drawing/2016/ink" xmlns:am3d="http://schemas.microsoft.com/office/drawing/2017/model3d" xmlns:o="urn:schemas-microsoft-com:office:office" xmlns:oel="http://schemas.microsoft.com/office/2019/extlst" xmlns:r="http://schemas.openxmlformats.org/officeDocument/2006/relationships" xmlns:m="http://schemas.openxmlformats.org/officeDocument/2006/math" xmlns:v="urn:schemas-microsoft-com:vml" xmlns:wp14="http://schemas.microsoft.com/office/word/2010/wordprocessingDrawing" xmlns:wp="http://schemas.openxmlformats.org/drawingml/2006/wordprocessingDrawing" xmlns:w10="urn:schemas-microsoft-com:office:word" xmlns:w="http://schemas.openxmlformats.org/wordprocessingml/2006/main" xmlns:w14="http://schemas.microsoft.com/office/word/2010/wordml" xmlns:w15="http://schemas.microsoft.com/office/word/2012/wordml" xmlns:w16cex="http://schemas.microsoft.com/office/word/2018/wordml/cex" xmlns:w16cid="http://schemas.microsoft.com/office/word/2016/wordml/cid" xmlns:w16="http://schemas.microsoft.com/office/word/2018/wordml" xmlns:w16du="http://schemas.microsoft.com/office/word/2023/wordml/word16du" xmlns:w16sdtdh="http://schemas.microsoft.com/office/word/2020/wordml/sdtdatahash" xmlns:w16sdtfl="http://schemas.microsoft.com/office/word/2024/wordml/sdtformatlock" xmlns:w16se="http://schemas.microsoft.com/office/word/2015/wordml/symex" xmlns:wpg="http://schemas.microsoft.com/office/word/2010/wordprocessingGroup" xmlns:wpi="http://schemas.microsoft.com/office/word/2010/wordprocessingInk" xmlns:wne="http://schemas.microsoft.com/office/word/2006/wordml" xmlns:wps="http://schemas.microsoft.com/office/word/2010/wordprocessingShape" mc:Ignorable="w14 w15 w16se w16cid w16 w16cex w16sdtdh w16sdtfl w16du wp14">
   <w:body>
     <w:p>
       <w:pPr>
@@ -68,7 +68,13 @@
           <w:lang w:val="es-CO"/>
         </w:rPr>
         <w:br/>
-        <w:t>Autor: Yeison Micolta R.</w:t>
+        <w:t>Autor: Yeison Micolta R</w:t>
+      </w:r>
+      <w:r>
+        <w:rPr>
+          <w:lang w:val="es-CO"/>
+        </w:rPr>
+        <w:t xml:space="preserve"> &amp; Yesenia Castro A</w:t>
       </w:r>
       <w:r>
         <w:rPr>
@@ -821,7 +827,6 @@
           </w:tcPr>
           <w:p>
             <w:r>
-              <w:lastRenderedPageBreak/>
               <w:t>RF-14</w:t>
             </w:r>
           </w:p>
@@ -1592,7 +1597,19 @@
               <w:rPr>
                 <w:lang w:val="es-CO"/>
               </w:rPr>
-              <w:t>Validar que las calificaciones estén entre 0 y 10 con dos decimales.</w:t>
+              <w:t xml:space="preserve">Validar que las calificaciones estén entre 0 y </w:t>
+            </w:r>
+            <w:r>
+              <w:rPr>
+                <w:lang w:val="es-CO"/>
+              </w:rPr>
+              <w:t xml:space="preserve">5 </w:t>
+            </w:r>
+            <w:r>
+              <w:rPr>
+                <w:lang w:val="es-CO"/>
+              </w:rPr>
+              <w:t>con dos decimales.</w:t>
             </w:r>
           </w:p>
         </w:tc>
@@ -1674,7 +1691,6 @@
       </w:pPr>
       <w:proofErr w:type="spellStart"/>
       <w:r>
-        <w:lastRenderedPageBreak/>
         <w:t>Módulo</w:t>
       </w:r>
       <w:proofErr w:type="spellEnd"/>
@@ -1888,7 +1904,6 @@
         <w:pStyle w:val="Ttulo1"/>
       </w:pPr>
       <w:r>
-        <w:lastRenderedPageBreak/>
         <w:t xml:space="preserve">3. </w:t>
       </w:r>
       <w:proofErr w:type="spellStart"/>
@@ -2264,7 +2279,6 @@
         <w:rPr>
           <w:lang w:val="es-CO"/>
         </w:rPr>
-        <w:lastRenderedPageBreak/>
         <w:t>Casos de Uso del Sistema de Gestión Académica</w:t>
       </w:r>
     </w:p>
@@ -2278,21 +2292,7 @@
         <w:rPr>
           <w:lang w:val="es-CO"/>
         </w:rPr>
-        <w:t xml:space="preserve">A </w:t>
-      </w:r>
-      <w:proofErr w:type="gramStart"/>
-      <w:r>
-        <w:rPr>
-          <w:lang w:val="es-CO"/>
-        </w:rPr>
-        <w:t>continuación</w:t>
-      </w:r>
-      <w:proofErr w:type="gramEnd"/>
-      <w:r>
-        <w:rPr>
-          <w:lang w:val="es-CO"/>
-        </w:rPr>
-        <w:t xml:space="preserve"> se presentan los casos de uso que describen las principales interacciones entre los usuarios y el sistema, de acuerdo con los módulos definidos en el documento de requisitos.</w:t>
+        <w:t>A continuación se presentan los casos de uso que describen las principales interacciones entre los usuarios y el sistema, de acuerdo con los módulos definidos en el documento de requisitos.</w:t>
       </w:r>
     </w:p>
     <w:p>
@@ -2761,7 +2761,6 @@
           <w:bCs/>
           <w:lang w:val="es-CO"/>
         </w:rPr>
-        <w:lastRenderedPageBreak/>
         <w:t>Actor:</w:t>
       </w:r>
       <w:r>
@@ -3319,7 +3318,6 @@
           <w:bCs/>
           <w:lang w:val="es-CO"/>
         </w:rPr>
-        <w:lastRenderedPageBreak/>
         <w:t>Descripción:</w:t>
       </w:r>
       <w:r>
@@ -3850,7 +3848,6 @@
           <w:bCs/>
           <w:lang w:val="es-CO"/>
         </w:rPr>
-        <w:lastRenderedPageBreak/>
         <w:t>CU-012: Consultar Horario</w:t>
       </w:r>
     </w:p>
@@ -4402,7 +4399,6 @@
           <w:bCs/>
           <w:lang w:val="es-CO"/>
         </w:rPr>
-        <w:lastRenderedPageBreak/>
         <w:t>Postcondición:</w:t>
       </w:r>
       <w:r>
@@ -4987,7 +4983,6 @@
           <w:bCs/>
           <w:lang w:val="es-CO"/>
         </w:rPr>
-        <w:lastRenderedPageBreak/>
         <w:t>Descripción:</w:t>
       </w:r>
       <w:r>
@@ -5231,7 +5226,7 @@
 </file>
 
 <file path=word/numbering.xml><?xml version="1.0" encoding="utf-8"?>
-<w:numbering xmlns:wpc="http://schemas.microsoft.com/office/word/2010/wordprocessingCanvas" xmlns:cx="http://schemas.microsoft.com/office/drawing/2014/chartex" xmlns:cx1="http://schemas.microsoft.com/office/drawing/2015/9/8/chartex" xmlns:cx2="http://schemas.microsoft.com/office/drawing/2015/10/21/chartex" xmlns:cx3="http://schemas.microsoft.com/office/drawing/2016/5/9/chartex" xmlns:cx4="http://schemas.microsoft.com/office/drawing/2016/5/10/chartex" xmlns:cx5="http://schemas.microsoft.com/office/drawing/2016/5/11/chartex" xmlns:cx6="http://schemas.microsoft.com/office/drawing/2016/5/12/chartex" xmlns:cx7="http://schemas.microsoft.com/office/drawing/2016/5/13/chartex" xmlns:cx8="http://schemas.microsoft.com/office/drawing/2016/5/14/chartex" xmlns:mc="http://schemas.openxmlformats.org/markup-compatibility/2006" xmlns:aink="http://schemas.microsoft.com/office/drawing/2016/ink" xmlns:am3d="http://schemas.microsoft.com/office/drawing/2017/model3d" xmlns:o="urn:schemas-microsoft-com:office:office" xmlns:oel="http://schemas.microsoft.com/office/2019/extlst" xmlns:r="http://schemas.openxmlformats.org/officeDocument/2006/relationships" xmlns:m="http://schemas.openxmlformats.org/officeDocument/2006/math" xmlns:v="urn:schemas-microsoft-com:vml" xmlns:wp14="http://schemas.microsoft.com/office/word/2010/wordprocessingDrawing" xmlns:wp="http://schemas.openxmlformats.org/drawingml/2006/wordprocessingDrawing" xmlns:w10="urn:schemas-microsoft-com:office:word" xmlns:w="http://schemas.openxmlformats.org/wordprocessingml/2006/main" xmlns:w14="http://schemas.microsoft.com/office/word/2010/wordml" xmlns:w15="http://schemas.microsoft.com/office/word/2012/wordml" xmlns:w16cex="http://schemas.microsoft.com/office/word/2018/wordml/cex" xmlns:w16cid="http://schemas.microsoft.com/office/word/2016/wordml/cid" xmlns:w16="http://schemas.microsoft.com/office/word/2018/wordml" xmlns:w16sdtdh="http://schemas.microsoft.com/office/word/2020/wordml/sdtdatahash" xmlns:w16se="http://schemas.microsoft.com/office/word/2015/wordml/symex" xmlns:wpg="http://schemas.microsoft.com/office/word/2010/wordprocessingGroup" xmlns:wpi="http://schemas.microsoft.com/office/word/2010/wordprocessingInk" xmlns:wne="http://schemas.microsoft.com/office/word/2006/wordml" xmlns:wps="http://schemas.microsoft.com/office/word/2010/wordprocessingShape" mc:Ignorable="w14 w15 w16se w16cid w16 w16cex w16sdtdh wp14">
+<w:numbering xmlns:wpc="http://schemas.microsoft.com/office/word/2010/wordprocessingCanvas" xmlns:cx="http://schemas.microsoft.com/office/drawing/2014/chartex" xmlns:cx1="http://schemas.microsoft.com/office/drawing/2015/9/8/chartex" xmlns:cx2="http://schemas.microsoft.com/office/drawing/2015/10/21/chartex" xmlns:cx3="http://schemas.microsoft.com/office/drawing/2016/5/9/chartex" xmlns:cx4="http://schemas.microsoft.com/office/drawing/2016/5/10/chartex" xmlns:cx5="http://schemas.microsoft.com/office/drawing/2016/5/11/chartex" xmlns:cx6="http://schemas.microsoft.com/office/drawing/2016/5/12/chartex" xmlns:cx7="http://schemas.microsoft.com/office/drawing/2016/5/13/chartex" xmlns:cx8="http://schemas.microsoft.com/office/drawing/2016/5/14/chartex" xmlns:mc="http://schemas.openxmlformats.org/markup-compatibility/2006" xmlns:aink="http://schemas.microsoft.com/office/drawing/2016/ink" xmlns:am3d="http://schemas.microsoft.com/office/drawing/2017/model3d" xmlns:o="urn:schemas-microsoft-com:office:office" xmlns:oel="http://schemas.microsoft.com/office/2019/extlst" xmlns:r="http://schemas.openxmlformats.org/officeDocument/2006/relationships" xmlns:m="http://schemas.openxmlformats.org/officeDocument/2006/math" xmlns:v="urn:schemas-microsoft-com:vml" xmlns:wp14="http://schemas.microsoft.com/office/word/2010/wordprocessingDrawing" xmlns:wp="http://schemas.openxmlformats.org/drawingml/2006/wordprocessingDrawing" xmlns:w10="urn:schemas-microsoft-com:office:word" xmlns:w="http://schemas.openxmlformats.org/wordprocessingml/2006/main" xmlns:w14="http://schemas.microsoft.com/office/word/2010/wordml" xmlns:w15="http://schemas.microsoft.com/office/word/2012/wordml" xmlns:w16cex="http://schemas.microsoft.com/office/word/2018/wordml/cex" xmlns:w16cid="http://schemas.microsoft.com/office/word/2016/wordml/cid" xmlns:w16="http://schemas.microsoft.com/office/word/2018/wordml" xmlns:w16du="http://schemas.microsoft.com/office/word/2023/wordml/word16du" xmlns:w16sdtdh="http://schemas.microsoft.com/office/word/2020/wordml/sdtdatahash" xmlns:w16sdtfl="http://schemas.microsoft.com/office/word/2024/wordml/sdtformatlock" xmlns:w16se="http://schemas.microsoft.com/office/word/2015/wordml/symex" xmlns:wpg="http://schemas.microsoft.com/office/word/2010/wordprocessingGroup" xmlns:wpi="http://schemas.microsoft.com/office/word/2010/wordprocessingInk" xmlns:wne="http://schemas.microsoft.com/office/word/2006/wordml" xmlns:wps="http://schemas.microsoft.com/office/word/2010/wordprocessingShape" mc:Ignorable="w14 w15 w16se w16cid w16 w16cex w16sdtdh w16sdtfl w16du wp14">
   <w:abstractNum w:abstractNumId="0" w15:restartNumberingAfterBreak="0">
     <w:nsid w:val="FFFFFF7C"/>
     <w:multiLevelType w:val="singleLevel"/>
@@ -9074,7 +9069,7 @@
 </file>
 
 <file path=word/styles.xml><?xml version="1.0" encoding="utf-8"?>
-<w:styles xmlns:mc="http://schemas.openxmlformats.org/markup-compatibility/2006" xmlns:r="http://schemas.openxmlformats.org/officeDocument/2006/relationships" xmlns:w="http://schemas.openxmlformats.org/wordprocessingml/2006/main" xmlns:w14="http://schemas.microsoft.com/office/word/2010/wordml" xmlns:w15="http://schemas.microsoft.com/office/word/2012/wordml" xmlns:w16cex="http://schemas.microsoft.com/office/word/2018/wordml/cex" xmlns:w16cid="http://schemas.microsoft.com/office/word/2016/wordml/cid" xmlns:w16="http://schemas.microsoft.com/office/word/2018/wordml" xmlns:w16sdtdh="http://schemas.microsoft.com/office/word/2020/wordml/sdtdatahash" xmlns:w16se="http://schemas.microsoft.com/office/word/2015/wordml/symex" mc:Ignorable="w14 w15 w16se w16cid w16 w16cex w16sdtdh">
+<w:styles xmlns:mc="http://schemas.openxmlformats.org/markup-compatibility/2006" xmlns:r="http://schemas.openxmlformats.org/officeDocument/2006/relationships" xmlns:w="http://schemas.openxmlformats.org/wordprocessingml/2006/main" xmlns:w14="http://schemas.microsoft.com/office/word/2010/wordml" xmlns:w15="http://schemas.microsoft.com/office/word/2012/wordml" xmlns:w16cex="http://schemas.microsoft.com/office/word/2018/wordml/cex" xmlns:w16cid="http://schemas.microsoft.com/office/word/2016/wordml/cid" xmlns:w16="http://schemas.microsoft.com/office/word/2018/wordml" xmlns:w16du="http://schemas.microsoft.com/office/word/2023/wordml/word16du" xmlns:w16sdtdh="http://schemas.microsoft.com/office/word/2020/wordml/sdtdatahash" xmlns:w16sdtfl="http://schemas.microsoft.com/office/word/2024/wordml/sdtformatlock" xmlns:w16se="http://schemas.microsoft.com/office/word/2015/wordml/symex" mc:Ignorable="w14 w15 w16se w16cid w16 w16cex w16sdtdh w16sdtfl w16du">
   <w:docDefaults>
     <w:rPrDefault>
       <w:rPr>
@@ -9358,11 +9353,6 @@
     <w:lsdException w:name="Book Title" w:uiPriority="33" w:qFormat="1"/>
     <w:lsdException w:name="Bibliography" w:semiHidden="1" w:uiPriority="37" w:unhideWhenUsed="1"/>
     <w:lsdException w:name="TOC Heading" w:semiHidden="1" w:uiPriority="39" w:unhideWhenUsed="1" w:qFormat="1"/>
-    <w:lsdException w:name="Plain Table 5" w:semiHidden="1" w:unhideWhenUsed="1"/>
-    <w:lsdException w:name="Grid Table Light" w:semiHidden="1" w:unhideWhenUsed="1"/>
-    <w:lsdException w:name="Grid Table 1 Light" w:semiHidden="1" w:unhideWhenUsed="1"/>
-    <w:lsdException w:name="Grid Table 2" w:semiHidden="1" w:unhideWhenUsed="1"/>
-    <w:lsdException w:name="Grid Table 3" w:semiHidden="1" w:unhideWhenUsed="1"/>
     <w:lsdException w:name="Grid Table 4" w:uiPriority="49"/>
     <w:lsdException w:name="Grid Table 5 Dark" w:uiPriority="50"/>
     <w:lsdException w:name="Grid Table 6 Colorful" w:uiPriority="51"/>
@@ -9681,6 +9671,7 @@
   <w:style w:type="character" w:default="1" w:styleId="Fuentedeprrafopredeter">
     <w:name w:val="Default Paragraph Font"/>
     <w:uiPriority w:val="1"/>
+    <w:semiHidden/>
     <w:unhideWhenUsed/>
   </w:style>
   <w:style w:type="table" w:default="1" w:styleId="Tablanormal">

</xml_diff>